<commit_message>
Update user manual with screenshots (illustrated version)
</commit_message>
<xml_diff>
--- a/Manual_Utilizador_OCTANE.docx
+++ b/Manual_Utilizador_OCTANE.docx
@@ -2,7 +2,6 @@
 <file path=word/document.xml><?xml version="1.0" encoding="utf-8"?>
 <w:document xmlns:wpc="http://schemas.microsoft.com/office/word/2010/wordprocessingCanvas" xmlns:mo="http://schemas.microsoft.com/office/mac/office/2008/main" xmlns:mc="http://schemas.openxmlformats.org/markup-compatibility/2006" xmlns:mv="urn:schemas-microsoft-com:mac:vml" xmlns:o="urn:schemas-microsoft-com:office:office" xmlns:r="http://schemas.openxmlformats.org/officeDocument/2006/relationships" xmlns:m="http://schemas.openxmlformats.org/officeDocument/2006/math" xmlns:v="urn:schemas-microsoft-com:vml" xmlns:wp14="http://schemas.microsoft.com/office/word/2010/wordprocessingDrawing" xmlns:wp="http://schemas.openxmlformats.org/drawingml/2006/wordprocessingDrawing" xmlns:w10="urn:schemas-microsoft-com:office:word" xmlns:w="http://schemas.openxmlformats.org/wordprocessingml/2006/main" xmlns:w14="http://schemas.microsoft.com/office/word/2010/wordml" xmlns:wpg="http://schemas.microsoft.com/office/word/2010/wordprocessingGroup" xmlns:wpi="http://schemas.microsoft.com/office/word/2010/wordprocessingInk" xmlns:wne="http://schemas.microsoft.com/office/word/2006/wordml" xmlns:wps="http://schemas.microsoft.com/office/word/2010/wordprocessingShape" mc:Ignorable="w14 wp14">
   <w:body>
-    <w:p/>
     <w:p/>
     <w:p/>
     <w:p/>
@@ -76,7 +75,7 @@
           <w:color w:val="555555"/>
           <w:sz w:val="22"/>
         </w:rPr>
-        <w:t>Versão 1.0</w:t>
+        <w:t>Versão 1.0 · Manual Ilustrado</w:t>
       </w:r>
     </w:p>
     <w:p>
@@ -98,97 +97,61 @@
     </w:p>
     <w:p>
       <w:r>
-        <w:rPr>
-          <w:sz w:val="22"/>
-        </w:rPr>
         <w:t>1. Introdução</w:t>
       </w:r>
     </w:p>
     <w:p>
       <w:r>
-        <w:rPr>
-          <w:sz w:val="22"/>
-        </w:rPr>
         <w:t>2. Aceder à Aplicação</w:t>
       </w:r>
     </w:p>
     <w:p>
       <w:r>
-        <w:rPr>
-          <w:sz w:val="22"/>
-        </w:rPr>
         <w:t>3. Tipos de Utilizador (Perfis)</w:t>
       </w:r>
     </w:p>
     <w:p>
       <w:r>
-        <w:rPr>
-          <w:sz w:val="22"/>
-        </w:rPr>
         <w:t>4. Dashboard (Painel Principal)</w:t>
       </w:r>
     </w:p>
     <w:p>
       <w:r>
-        <w:rPr>
-          <w:sz w:val="22"/>
-        </w:rPr>
         <w:t>5. Gestão de Viaturas</w:t>
       </w:r>
     </w:p>
     <w:p>
       <w:r>
-        <w:rPr>
-          <w:sz w:val="22"/>
-        </w:rPr>
         <w:t>6. Histórico de Alterações das Viaturas</w:t>
       </w:r>
     </w:p>
     <w:p>
       <w:r>
-        <w:rPr>
-          <w:sz w:val="22"/>
-        </w:rPr>
         <w:t>7. Investidores</w:t>
       </w:r>
     </w:p>
     <w:p>
       <w:r>
-        <w:rPr>
-          <w:sz w:val="22"/>
-        </w:rPr>
         <w:t>8. Relatórios</w:t>
       </w:r>
     </w:p>
     <w:p>
       <w:r>
-        <w:rPr>
-          <w:sz w:val="22"/>
-        </w:rPr>
         <w:t>9. Gestão de Utilizadores</w:t>
       </w:r>
     </w:p>
     <w:p>
       <w:r>
-        <w:rPr>
-          <w:sz w:val="22"/>
-        </w:rPr>
         <w:t>10. O Meu Perfil</w:t>
       </w:r>
     </w:p>
     <w:p>
       <w:r>
-        <w:rPr>
-          <w:sz w:val="22"/>
-        </w:rPr>
         <w:t>11. Portal do Investidor</w:t>
       </w:r>
     </w:p>
     <w:p>
       <w:r>
-        <w:rPr>
-          <w:sz w:val="22"/>
-        </w:rPr>
         <w:t>12. Perguntas Frequentes</w:t>
       </w:r>
     </w:p>
@@ -321,7 +284,7 @@
       <w:r>
         <w:rPr>
           <w:color w:val="8A6A10"/>
-          <w:sz w:val="28"/>
+          <w:sz w:val="26"/>
         </w:rPr>
         <w:t>Iniciar sessão</w:t>
       </w:r>
@@ -331,7 +294,7 @@
         <w:pStyle w:val="ListNumber"/>
       </w:pPr>
       <w:r>
-        <w:t>Abra o endereço da aplicação no seu navegador (ex: Chrome, Safari, Edge).</w:t>
+        <w:t>Abra o endereço da aplicação no seu navegador (Chrome, Safari, Edge).</w:t>
       </w:r>
     </w:p>
     <w:p>
@@ -352,6 +315,59 @@
     </w:p>
     <w:p/>
     <w:p>
+      <w:pPr>
+        <w:jc w:val="center"/>
+      </w:pPr>
+      <w:r>
+        <w:drawing>
+          <wp:inline xmlns:a="http://schemas.openxmlformats.org/drawingml/2006/main" xmlns:pic="http://schemas.openxmlformats.org/drawingml/2006/picture">
+            <wp:extent cx="5669280" cy="3986212"/>
+            <wp:docPr id="1" name="Picture 1"/>
+            <wp:cNvGraphicFramePr>
+              <a:graphicFrameLocks noChangeAspect="1"/>
+            </wp:cNvGraphicFramePr>
+            <a:graphic>
+              <a:graphicData uri="http://schemas.openxmlformats.org/drawingml/2006/picture">
+                <pic:pic>
+                  <pic:nvPicPr>
+                    <pic:cNvPr id="0" name="01-login.png"/>
+                    <pic:cNvPicPr/>
+                  </pic:nvPicPr>
+                  <pic:blipFill>
+                    <a:blip r:embed="rId9"/>
+                    <a:stretch>
+                      <a:fillRect/>
+                    </a:stretch>
+                  </pic:blipFill>
+                  <pic:spPr>
+                    <a:xfrm>
+                      <a:off x="0" y="0"/>
+                      <a:ext cx="5669280" cy="3986212"/>
+                    </a:xfrm>
+                    <a:prstGeom prst="rect"/>
+                  </pic:spPr>
+                </pic:pic>
+              </a:graphicData>
+            </a:graphic>
+          </wp:inline>
+        </w:drawing>
+      </w:r>
+    </w:p>
+    <w:p>
+      <w:pPr>
+        <w:jc w:val="center"/>
+      </w:pPr>
+      <w:r>
+        <w:rPr>
+          <w:i/>
+          <w:color w:val="555555"/>
+          <w:sz w:val="18"/>
+        </w:rPr>
+        <w:t>Figura 1 — Ecrã de início de sessão.</w:t>
+      </w:r>
+    </w:p>
+    <w:p/>
+    <w:p>
       <w:r>
         <w:rPr>
           <w:b w:val="0"/>
@@ -359,30 +375,7 @@
           <w:color w:val="555555"/>
           <w:sz w:val="22"/>
         </w:rPr>
-        <w:t>Nota: Se a sua conta tiver sido suspensa, receberá a mensagem «Conta suspensa. Contacte o administrador.» e não conseguirá entrar. Nesse caso, contacte o seu diretor ou administrador.</w:t>
-      </w:r>
-    </w:p>
-    <w:p/>
-    <w:p>
-      <w:pPr>
-        <w:pStyle w:val="Heading2"/>
-      </w:pPr>
-      <w:r>
-        <w:rPr>
-          <w:color w:val="8A6A10"/>
-          <w:sz w:val="28"/>
-        </w:rPr>
-        <w:t>Terminar sessão</w:t>
-      </w:r>
-    </w:p>
-    <w:p>
-      <w:r>
-        <w:rPr>
-          <w:b w:val="0"/>
-          <w:i w:val="0"/>
-          <w:sz w:val="22"/>
-        </w:rPr>
-        <w:t>Para sair em segurança, clique no botão «Sair» no canto superior direito, ao lado do seu nome.</w:t>
+        <w:t>Nota: Se a sua conta tiver sido suspensa, receberá a mensagem «Conta suspensa. Contacte o administrador.». Para sair em segurança, clique em «Sair» no canto superior direito.</w:t>
       </w:r>
     </w:p>
     <w:p>
@@ -500,7 +493,7 @@
           </w:tcPr>
           <w:p>
             <w:r>
-              <w:t>Gere a sua equipa: comerciais e investidores. Vê e edita todas as viaturas da equipa, cria e gere investidores, acede a relatórios e pode suspender/apagar os comerciais e investidores que lhe estão associados.</w:t>
+              <w:t>Gere a sua equipa: comerciais e investidores. Vê e edita as viaturas da equipa, cria e gere investidores, acede a relatórios e pode suspender/apagar os comerciais e investidores associados.</w:t>
             </w:r>
           </w:p>
         </w:tc>
@@ -586,12 +579,65 @@
     <w:p/>
     <w:p>
       <w:pPr>
+        <w:jc w:val="center"/>
+      </w:pPr>
+      <w:r>
+        <w:drawing>
+          <wp:inline xmlns:a="http://schemas.openxmlformats.org/drawingml/2006/main" xmlns:pic="http://schemas.openxmlformats.org/drawingml/2006/picture">
+            <wp:extent cx="5669280" cy="3986212"/>
+            <wp:docPr id="2" name="Picture 2"/>
+            <wp:cNvGraphicFramePr>
+              <a:graphicFrameLocks noChangeAspect="1"/>
+            </wp:cNvGraphicFramePr>
+            <a:graphic>
+              <a:graphicData uri="http://schemas.openxmlformats.org/drawingml/2006/picture">
+                <pic:pic>
+                  <pic:nvPicPr>
+                    <pic:cNvPr id="0" name="02-dashboard.png"/>
+                    <pic:cNvPicPr/>
+                  </pic:nvPicPr>
+                  <pic:blipFill>
+                    <a:blip r:embed="rId10"/>
+                    <a:stretch>
+                      <a:fillRect/>
+                    </a:stretch>
+                  </pic:blipFill>
+                  <pic:spPr>
+                    <a:xfrm>
+                      <a:off x="0" y="0"/>
+                      <a:ext cx="5669280" cy="3986212"/>
+                    </a:xfrm>
+                    <a:prstGeom prst="rect"/>
+                  </pic:spPr>
+                </pic:pic>
+              </a:graphicData>
+            </a:graphic>
+          </wp:inline>
+        </w:drawing>
+      </w:r>
+    </w:p>
+    <w:p>
+      <w:pPr>
+        <w:jc w:val="center"/>
+      </w:pPr>
+      <w:r>
+        <w:rPr>
+          <w:i/>
+          <w:color w:val="555555"/>
+          <w:sz w:val="18"/>
+        </w:rPr>
+        <w:t>Figura 2 — Dashboard com indicadores e gráfico de evolução.</w:t>
+      </w:r>
+    </w:p>
+    <w:p/>
+    <w:p>
+      <w:pPr>
         <w:pStyle w:val="Heading2"/>
       </w:pPr>
       <w:r>
         <w:rPr>
           <w:color w:val="8A6A10"/>
-          <w:sz w:val="28"/>
+          <w:sz w:val="26"/>
         </w:rPr>
         <w:t>Indicadores (cartões de topo)</w:t>
       </w:r>
@@ -601,7 +647,7 @@
         <w:pStyle w:val="ListBullet"/>
       </w:pPr>
       <w:r>
-        <w:t>Total Viaturas — número total de viaturas registadas.</w:t>
+        <w:t>Total Viaturas, Em Stock, Vendidas, Reservadas — contagens por estado.</w:t>
       </w:r>
     </w:p>
     <w:p>
@@ -609,47 +655,7 @@
         <w:pStyle w:val="ListBullet"/>
       </w:pPr>
       <w:r>
-        <w:t>Em Stock — viaturas disponíveis para venda.</w:t>
-      </w:r>
-    </w:p>
-    <w:p>
-      <w:pPr>
-        <w:pStyle w:val="ListBullet"/>
-      </w:pPr>
-      <w:r>
-        <w:t>Vendidas — viaturas já vendidas.</w:t>
-      </w:r>
-    </w:p>
-    <w:p>
-      <w:pPr>
-        <w:pStyle w:val="ListBullet"/>
-      </w:pPr>
-      <w:r>
-        <w:t>Reservadas — viaturas reservadas.</w:t>
-      </w:r>
-    </w:p>
-    <w:p>
-      <w:pPr>
-        <w:pStyle w:val="ListBullet"/>
-      </w:pPr>
-      <w:r>
-        <w:t>Total Compras — soma dos preços de compra.</w:t>
-      </w:r>
-    </w:p>
-    <w:p>
-      <w:pPr>
-        <w:pStyle w:val="ListBullet"/>
-      </w:pPr>
-      <w:r>
-        <w:t>Total Vendas — soma dos preços de venda.</w:t>
-      </w:r>
-    </w:p>
-    <w:p>
-      <w:pPr>
-        <w:pStyle w:val="ListBullet"/>
-      </w:pPr>
-      <w:r>
-        <w:t>Total Custos — soma de todos os custos das viaturas.</w:t>
+        <w:t>Total Compras, Total Vendas, Total Custos — somatórios financeiros.</w:t>
       </w:r>
     </w:p>
     <w:p>
@@ -668,7 +674,7 @@
       <w:r>
         <w:rPr>
           <w:color w:val="8A6A10"/>
-          <w:sz w:val="28"/>
+          <w:sz w:val="26"/>
         </w:rPr>
         <w:t>Detalhe da Margem Bruta</w:t>
       </w:r>
@@ -680,33 +686,60 @@
           <w:i w:val="0"/>
           <w:sz w:val="22"/>
         </w:rPr>
-        <w:t>O cartão «Margem Bruta» é clicável. Ao clicar, abre uma janela com o detalhe de todas as viaturas que contribuem para a margem, separadas em:</w:t>
+        <w:t>O cartão «Margem Bruta» é clicável. Ao clicar, abre uma janela com o detalhe de todas as viaturas que contribuem para a margem, separadas em Vendidas (contribuem positivamente) e Em Carteira (capital imobilizado que reduz a margem até à venda).</w:t>
+      </w:r>
+    </w:p>
+    <w:p/>
+    <w:p>
+      <w:pPr>
+        <w:jc w:val="center"/>
+      </w:pPr>
+      <w:r>
+        <w:drawing>
+          <wp:inline xmlns:a="http://schemas.openxmlformats.org/drawingml/2006/main" xmlns:pic="http://schemas.openxmlformats.org/drawingml/2006/picture">
+            <wp:extent cx="5669280" cy="3986212"/>
+            <wp:docPr id="3" name="Picture 3"/>
+            <wp:cNvGraphicFramePr>
+              <a:graphicFrameLocks noChangeAspect="1"/>
+            </wp:cNvGraphicFramePr>
+            <a:graphic>
+              <a:graphicData uri="http://schemas.openxmlformats.org/drawingml/2006/picture">
+                <pic:pic>
+                  <pic:nvPicPr>
+                    <pic:cNvPr id="0" name="03-margem-drilldown.png"/>
+                    <pic:cNvPicPr/>
+                  </pic:nvPicPr>
+                  <pic:blipFill>
+                    <a:blip r:embed="rId11"/>
+                    <a:stretch>
+                      <a:fillRect/>
+                    </a:stretch>
+                  </pic:blipFill>
+                  <pic:spPr>
+                    <a:xfrm>
+                      <a:off x="0" y="0"/>
+                      <a:ext cx="5669280" cy="3986212"/>
+                    </a:xfrm>
+                    <a:prstGeom prst="rect"/>
+                  </pic:spPr>
+                </pic:pic>
+              </a:graphicData>
+            </a:graphic>
+          </wp:inline>
+        </w:drawing>
       </w:r>
     </w:p>
     <w:p>
       <w:pPr>
-        <w:pStyle w:val="ListBullet"/>
+        <w:jc w:val="center"/>
       </w:pPr>
       <w:r>
-        <w:t>Vendidas — contribuem positivamente (Venda − Compra − Custos).</w:t>
-      </w:r>
-    </w:p>
-    <w:p>
-      <w:pPr>
-        <w:pStyle w:val="ListBullet"/>
-      </w:pPr>
-      <w:r>
-        <w:t>Em Carteira — viaturas ainda não vendidas, cujo capital está imobilizado, e que reduzem a margem até serem vendidas.</w:t>
-      </w:r>
-    </w:p>
-    <w:p>
-      <w:r>
         <w:rPr>
-          <w:b w:val="0"/>
-          <w:i w:val="0"/>
-          <w:sz w:val="22"/>
+          <w:i/>
+          <w:color w:val="555555"/>
+          <w:sz w:val="18"/>
         </w:rPr>
-        <w:t>Esta janela mostra a fórmula de cálculo e os totais, para total transparência.</w:t>
+        <w:t>Figura 3 — Detalhe da composição da Margem Bruta.</w:t>
       </w:r>
     </w:p>
     <w:p/>
@@ -717,7 +750,7 @@
       <w:r>
         <w:rPr>
           <w:color w:val="8A6A10"/>
-          <w:sz w:val="28"/>
+          <w:sz w:val="26"/>
         </w:rPr>
         <w:t>Gráfico de Evolução</w:t>
       </w:r>
@@ -729,41 +762,7 @@
           <w:i w:val="0"/>
           <w:sz w:val="22"/>
         </w:rPr>
-        <w:t>Abaixo dos indicadores existe um gráfico que mostra, ao longo do tempo:</w:t>
-      </w:r>
-    </w:p>
-    <w:p>
-      <w:pPr>
-        <w:pStyle w:val="ListBullet"/>
-      </w:pPr>
-      <w:r>
-        <w:t>Barras cinzentas — viaturas em stock.</w:t>
-      </w:r>
-    </w:p>
-    <w:p>
-      <w:pPr>
-        <w:pStyle w:val="ListBullet"/>
-      </w:pPr>
-      <w:r>
-        <w:t>Barras verdes — viaturas vendidas.</w:t>
-      </w:r>
-    </w:p>
-    <w:p>
-      <w:pPr>
-        <w:pStyle w:val="ListBullet"/>
-      </w:pPr>
-      <w:r>
-        <w:t>Linha dourada — margem acumulada.</w:t>
-      </w:r>
-    </w:p>
-    <w:p>
-      <w:r>
-        <w:rPr>
-          <w:b w:val="0"/>
-          <w:i w:val="0"/>
-          <w:sz w:val="22"/>
-        </w:rPr>
-        <w:t>Pode ajustar o intervalo de datas com os botões rápidos (Último mês, 3 meses, 365 dias, Este ano) ou escolhendo datas específicas. O botão «Excluir Investidores» permite retirar do cálculo as viaturas financiadas por investidores, para ver apenas o desempenho próprio do stand.</w:t>
+        <w:t>Mostra ao longo do tempo: barras cinzentas (em stock), barras verdes (vendidas) e linha dourada (margem acumulada). Pode ajustar o intervalo de datas ou usar o botão «Excluir Investidores» para ver apenas o desempenho próprio do stand.</w:t>
       </w:r>
     </w:p>
     <w:p>
@@ -790,7 +789,7 @@
       <w:r>
         <w:rPr>
           <w:color w:val="8A6A10"/>
-          <w:sz w:val="28"/>
+          <w:sz w:val="26"/>
         </w:rPr>
         <w:t>Ver viaturas</w:t>
       </w:r>
@@ -802,7 +801,60 @@
           <w:i w:val="0"/>
           <w:sz w:val="22"/>
         </w:rPr>
-        <w:t>No menu «Viaturas» encontra a lista de todas as viaturas a que tem acesso, com marca, modelo, ano, matrícula, preços, custos, estado e comercial responsável. Pode filtrar por estado (Todos, Em Stock, Vendido, Reservado) no canto superior direito.</w:t>
+        <w:t>No menu «Viaturas» encontra a lista de todas as viaturas a que tem acesso. Pode filtrar por estado no canto superior direito.</w:t>
+      </w:r>
+    </w:p>
+    <w:p/>
+    <w:p>
+      <w:pPr>
+        <w:jc w:val="center"/>
+      </w:pPr>
+      <w:r>
+        <w:drawing>
+          <wp:inline xmlns:a="http://schemas.openxmlformats.org/drawingml/2006/main" xmlns:pic="http://schemas.openxmlformats.org/drawingml/2006/picture">
+            <wp:extent cx="5669280" cy="3986212"/>
+            <wp:docPr id="4" name="Picture 4"/>
+            <wp:cNvGraphicFramePr>
+              <a:graphicFrameLocks noChangeAspect="1"/>
+            </wp:cNvGraphicFramePr>
+            <a:graphic>
+              <a:graphicData uri="http://schemas.openxmlformats.org/drawingml/2006/picture">
+                <pic:pic>
+                  <pic:nvPicPr>
+                    <pic:cNvPr id="0" name="04-viaturas.png"/>
+                    <pic:cNvPicPr/>
+                  </pic:nvPicPr>
+                  <pic:blipFill>
+                    <a:blip r:embed="rId12"/>
+                    <a:stretch>
+                      <a:fillRect/>
+                    </a:stretch>
+                  </pic:blipFill>
+                  <pic:spPr>
+                    <a:xfrm>
+                      <a:off x="0" y="0"/>
+                      <a:ext cx="5669280" cy="3986212"/>
+                    </a:xfrm>
+                    <a:prstGeom prst="rect"/>
+                  </pic:spPr>
+                </pic:pic>
+              </a:graphicData>
+            </a:graphic>
+          </wp:inline>
+        </w:drawing>
+      </w:r>
+    </w:p>
+    <w:p>
+      <w:pPr>
+        <w:jc w:val="center"/>
+      </w:pPr>
+      <w:r>
+        <w:rPr>
+          <w:i/>
+          <w:color w:val="555555"/>
+          <w:sz w:val="18"/>
+        </w:rPr>
+        <w:t>Figura 4 — Lista de viaturas.</w:t>
       </w:r>
     </w:p>
     <w:p/>
@@ -813,7 +865,7 @@
       <w:r>
         <w:rPr>
           <w:color w:val="8A6A10"/>
-          <w:sz w:val="28"/>
+          <w:sz w:val="26"/>
         </w:rPr>
         <w:t>Registar uma nova viatura</w:t>
       </w:r>
@@ -831,7 +883,7 @@
         <w:pStyle w:val="ListNumber"/>
       </w:pPr>
       <w:r>
-        <w:t>Preencha primeiro a Data (data de registo da viatura). Pode usar o botão «Hoje» para preencher automaticamente com a data atual.</w:t>
+        <w:t>Preencha primeiro a Data (pode usar o botão «Hoje»).</w:t>
       </w:r>
     </w:p>
     <w:p>
@@ -839,7 +891,7 @@
         <w:pStyle w:val="ListNumber"/>
       </w:pPr>
       <w:r>
-        <w:t>Preencha os dados: Marca, Modelo, Ano, Matrícula, VIN, Cor, Quilometragem e Combustível.</w:t>
+        <w:t>Preencha Marca, Modelo, Ano, Matrícula, VIN, Cor, Quilometragem e Combustível.</w:t>
       </w:r>
     </w:p>
     <w:p>
@@ -855,7 +907,7 @@
         <w:pStyle w:val="ListNumber"/>
       </w:pPr>
       <w:r>
-        <w:t>Se for Diretor ou Administrador, pode ainda escolher a quem atribuir a viatura e associar um Investidor.</w:t>
+        <w:t>Diretores/Administradores podem atribuir a viatura a um comercial e associar um investidor.</w:t>
       </w:r>
     </w:p>
     <w:p>
@@ -868,6 +920,59 @@
     </w:p>
     <w:p/>
     <w:p>
+      <w:pPr>
+        <w:jc w:val="center"/>
+      </w:pPr>
+      <w:r>
+        <w:drawing>
+          <wp:inline xmlns:a="http://schemas.openxmlformats.org/drawingml/2006/main" xmlns:pic="http://schemas.openxmlformats.org/drawingml/2006/picture">
+            <wp:extent cx="5669280" cy="3986212"/>
+            <wp:docPr id="5" name="Picture 5"/>
+            <wp:cNvGraphicFramePr>
+              <a:graphicFrameLocks noChangeAspect="1"/>
+            </wp:cNvGraphicFramePr>
+            <a:graphic>
+              <a:graphicData uri="http://schemas.openxmlformats.org/drawingml/2006/picture">
+                <pic:pic>
+                  <pic:nvPicPr>
+                    <pic:cNvPr id="0" name="06-nova-viatura.png"/>
+                    <pic:cNvPicPr/>
+                  </pic:nvPicPr>
+                  <pic:blipFill>
+                    <a:blip r:embed="rId13"/>
+                    <a:stretch>
+                      <a:fillRect/>
+                    </a:stretch>
+                  </pic:blipFill>
+                  <pic:spPr>
+                    <a:xfrm>
+                      <a:off x="0" y="0"/>
+                      <a:ext cx="5669280" cy="3986212"/>
+                    </a:xfrm>
+                    <a:prstGeom prst="rect"/>
+                  </pic:spPr>
+                </pic:pic>
+              </a:graphicData>
+            </a:graphic>
+          </wp:inline>
+        </w:drawing>
+      </w:r>
+    </w:p>
+    <w:p>
+      <w:pPr>
+        <w:jc w:val="center"/>
+      </w:pPr>
+      <w:r>
+        <w:rPr>
+          <w:i/>
+          <w:color w:val="555555"/>
+          <w:sz w:val="18"/>
+        </w:rPr>
+        <w:t>Figura 5 — Formulário de nova viatura (campo Data com botão «Hoje»).</w:t>
+      </w:r>
+    </w:p>
+    <w:p/>
+    <w:p>
       <w:r>
         <w:rPr>
           <w:b w:val="0"/>
@@ -875,63 +980,7 @@
           <w:color w:val="555555"/>
           <w:sz w:val="22"/>
         </w:rPr>
-        <w:t>Nota sobre atribuição: Quando um comercial regista uma viatura, esta fica automaticamente atribuída a si próprio. Apenas o diretor pode alterar a atribuição.</w:t>
-      </w:r>
-    </w:p>
-    <w:p/>
-    <w:p>
-      <w:pPr>
-        <w:pStyle w:val="Heading2"/>
-      </w:pPr>
-      <w:r>
-        <w:rPr>
-          <w:color w:val="8A6A10"/>
-          <w:sz w:val="28"/>
-        </w:rPr>
-        <w:t>Editar uma viatura</w:t>
-      </w:r>
-    </w:p>
-    <w:p>
-      <w:pPr>
-        <w:pStyle w:val="ListNumber"/>
-      </w:pPr>
-      <w:r>
-        <w:t>Na lista de viaturas, clique sobre a marca/modelo da viatura ou no botão «Editar».</w:t>
-      </w:r>
-    </w:p>
-    <w:p>
-      <w:pPr>
-        <w:pStyle w:val="ListNumber"/>
-      </w:pPr>
-      <w:r>
-        <w:t>Altere os campos pretendidos (por exemplo, mudar o estado para «Vendido» e introduzir o preço de venda).</w:t>
-      </w:r>
-    </w:p>
-    <w:p>
-      <w:pPr>
-        <w:pStyle w:val="ListNumber"/>
-      </w:pPr>
-      <w:r>
-        <w:t>Pode adicionar custos à viatura (manutenção, reparações, etc.).</w:t>
-      </w:r>
-    </w:p>
-    <w:p>
-      <w:pPr>
-        <w:pStyle w:val="ListNumber"/>
-      </w:pPr>
-      <w:r>
-        <w:t>Clique em «Guardar».</w:t>
-      </w:r>
-    </w:p>
-    <w:p/>
-    <w:p>
-      <w:r>
-        <w:rPr>
-          <w:b/>
-          <w:i w:val="0"/>
-          <w:sz w:val="22"/>
-        </w:rPr>
-        <w:t>Importante: Todas as alterações ficam registadas no histórico da viatura (ver secção 6).</w:t>
+        <w:t>Nota: Quando um comercial regista uma viatura, esta fica automaticamente atribuída a si próprio. Apenas o diretor pode alterar a atribuição.</w:t>
       </w:r>
     </w:p>
     <w:p>
@@ -958,7 +1007,7 @@
           <w:i w:val="0"/>
           <w:sz w:val="22"/>
         </w:rPr>
-        <w:t>Cada viatura mantém um registo completo de todas as alterações efetuadas — funcionando como uma auditoria.</w:t>
+        <w:t>Cada viatura mantém um registo completo de todas as alterações — funcionando como uma auditoria.</w:t>
       </w:r>
     </w:p>
     <w:p/>
@@ -969,9 +1018,9 @@
       <w:r>
         <w:rPr>
           <w:color w:val="8A6A10"/>
-          <w:sz w:val="28"/>
+          <w:sz w:val="26"/>
         </w:rPr>
-        <w:t>Como consultar o histórico</w:t>
+        <w:t>Como consultar</w:t>
       </w:r>
     </w:p>
     <w:p>
@@ -993,57 +1042,65 @@
     <w:p/>
     <w:p>
       <w:pPr>
-        <w:pStyle w:val="Heading2"/>
+        <w:jc w:val="center"/>
       </w:pPr>
       <w:r>
-        <w:rPr>
-          <w:color w:val="8A6A10"/>
-          <w:sz w:val="28"/>
-        </w:rPr>
-        <w:t>O que mostra o histórico</w:t>
+        <w:drawing>
+          <wp:inline xmlns:a="http://schemas.openxmlformats.org/drawingml/2006/main" xmlns:pic="http://schemas.openxmlformats.org/drawingml/2006/picture">
+            <wp:extent cx="5669280" cy="3986212"/>
+            <wp:docPr id="6" name="Picture 6"/>
+            <wp:cNvGraphicFramePr>
+              <a:graphicFrameLocks noChangeAspect="1"/>
+            </wp:cNvGraphicFramePr>
+            <a:graphic>
+              <a:graphicData uri="http://schemas.openxmlformats.org/drawingml/2006/picture">
+                <pic:pic>
+                  <pic:nvPicPr>
+                    <pic:cNvPr id="0" name="05-historico.png"/>
+                    <pic:cNvPicPr/>
+                  </pic:nvPicPr>
+                  <pic:blipFill>
+                    <a:blip r:embed="rId14"/>
+                    <a:stretch>
+                      <a:fillRect/>
+                    </a:stretch>
+                  </pic:blipFill>
+                  <pic:spPr>
+                    <a:xfrm>
+                      <a:off x="0" y="0"/>
+                      <a:ext cx="5669280" cy="3986212"/>
+                    </a:xfrm>
+                    <a:prstGeom prst="rect"/>
+                  </pic:spPr>
+                </pic:pic>
+              </a:graphicData>
+            </a:graphic>
+          </wp:inline>
+        </w:drawing>
       </w:r>
     </w:p>
     <w:p>
       <w:pPr>
-        <w:pStyle w:val="ListBullet"/>
+        <w:jc w:val="center"/>
       </w:pPr>
       <w:r>
-        <w:t>Quem fez a alteração (nome do utilizador).</w:t>
-      </w:r>
-    </w:p>
-    <w:p>
-      <w:pPr>
-        <w:pStyle w:val="ListBullet"/>
-      </w:pPr>
-      <w:r>
-        <w:t>Data e hora exatas da alteração.</w:t>
-      </w:r>
-    </w:p>
-    <w:p>
-      <w:pPr>
-        <w:pStyle w:val="ListBullet"/>
-      </w:pPr>
-      <w:r>
-        <w:t>O que mudou — campo a campo, com o valor anterior e o novo valor.</w:t>
-      </w:r>
-    </w:p>
-    <w:p>
-      <w:pPr>
-        <w:pStyle w:val="ListBullet"/>
-      </w:pPr>
-      <w:r>
-        <w:t>O tipo: «Registo» (criação inicial) ou «Alteração».</w:t>
+        <w:rPr>
+          <w:i/>
+          <w:color w:val="555555"/>
+          <w:sz w:val="18"/>
+        </w:rPr>
+        <w:t>Figura 6 — Histórico de alterações expandido numa viatura.</w:t>
       </w:r>
     </w:p>
     <w:p/>
     <w:p>
       <w:r>
         <w:rPr>
-          <w:b/>
+          <w:b w:val="0"/>
           <w:i w:val="0"/>
           <w:sz w:val="22"/>
         </w:rPr>
-        <w:t>A alteração mais recente aparece destacada a dourado com a indicação «● Atual (contabilizada)».</w:t>
+        <w:t>O histórico mostra quem alterou, data e hora, e o que mudou (campo a campo, valor anterior → novo valor). A alteração mais recente aparece destacada a dourado com «● Atual (contabilizada)».</w:t>
       </w:r>
     </w:p>
     <w:p/>
@@ -1055,7 +1112,7 @@
           <w:color w:val="555555"/>
           <w:sz w:val="22"/>
         </w:rPr>
-        <w:t>Nota sobre contabilização: Apenas o estado atual da viatura (a última alteração) conta para os cálculos dos relatórios e do dashboard. O histórico é meramente informativo, servindo para auditoria e rastreabilidade.</w:t>
+        <w:t>Nota sobre contabilização: Apenas o estado atual da viatura conta para os relatórios e o dashboard. O histórico é meramente informativo, para auditoria e rastreabilidade.</w:t>
       </w:r>
     </w:p>
     <w:p>
@@ -1085,7 +1142,6 @@
         <w:t>(Disponível para Administradores e Diretores)</w:t>
       </w:r>
     </w:p>
-    <w:p/>
     <w:p>
       <w:r>
         <w:rPr>
@@ -1093,7 +1149,60 @@
           <w:i w:val="0"/>
           <w:sz w:val="22"/>
         </w:rPr>
-        <w:t>Um investidor é uma pessoa que financia a compra de viaturas. A viatura fica em stock do stand, mas o capital pertence ao investidor até à venda.</w:t>
+        <w:t>Um investidor financia a compra de viaturas. A viatura fica no stock, mas o capital pertence ao investidor até à venda.</w:t>
+      </w:r>
+    </w:p>
+    <w:p/>
+    <w:p>
+      <w:pPr>
+        <w:jc w:val="center"/>
+      </w:pPr>
+      <w:r>
+        <w:drawing>
+          <wp:inline xmlns:a="http://schemas.openxmlformats.org/drawingml/2006/main" xmlns:pic="http://schemas.openxmlformats.org/drawingml/2006/picture">
+            <wp:extent cx="5669280" cy="3986212"/>
+            <wp:docPr id="7" name="Picture 7"/>
+            <wp:cNvGraphicFramePr>
+              <a:graphicFrameLocks noChangeAspect="1"/>
+            </wp:cNvGraphicFramePr>
+            <a:graphic>
+              <a:graphicData uri="http://schemas.openxmlformats.org/drawingml/2006/picture">
+                <pic:pic>
+                  <pic:nvPicPr>
+                    <pic:cNvPr id="0" name="07-investidores.png"/>
+                    <pic:cNvPicPr/>
+                  </pic:nvPicPr>
+                  <pic:blipFill>
+                    <a:blip r:embed="rId15"/>
+                    <a:stretch>
+                      <a:fillRect/>
+                    </a:stretch>
+                  </pic:blipFill>
+                  <pic:spPr>
+                    <a:xfrm>
+                      <a:off x="0" y="0"/>
+                      <a:ext cx="5669280" cy="3986212"/>
+                    </a:xfrm>
+                    <a:prstGeom prst="rect"/>
+                  </pic:spPr>
+                </pic:pic>
+              </a:graphicData>
+            </a:graphic>
+          </wp:inline>
+        </w:drawing>
+      </w:r>
+    </w:p>
+    <w:p>
+      <w:pPr>
+        <w:jc w:val="center"/>
+      </w:pPr>
+      <w:r>
+        <w:rPr>
+          <w:i/>
+          <w:color w:val="555555"/>
+          <w:sz w:val="18"/>
+        </w:rPr>
+        <w:t>Figura 7 — Gestão de investidores.</w:t>
       </w:r>
     </w:p>
     <w:p/>
@@ -1104,7 +1213,7 @@
       <w:r>
         <w:rPr>
           <w:color w:val="8A6A10"/>
-          <w:sz w:val="28"/>
+          <w:sz w:val="26"/>
         </w:rPr>
         <w:t>Gerir investidores</w:t>
       </w:r>
@@ -1114,7 +1223,7 @@
         <w:pStyle w:val="ListNumber"/>
       </w:pPr>
       <w:r>
-        <w:t>Aceda ao menu «Investidores».</w:t>
+        <w:t>Aceda ao menu «Investidores» e clique em «+ Novo Investidor».</w:t>
       </w:r>
     </w:p>
     <w:p>
@@ -1122,7 +1231,7 @@
         <w:pStyle w:val="ListNumber"/>
       </w:pPr>
       <w:r>
-        <w:t>Clique em «+ Novo Investidor» para adicionar (nome, email, telefone, notas).</w:t>
+        <w:t>Registe contribuições de capital (depósitos) de cada investidor.</w:t>
       </w:r>
     </w:p>
     <w:p>
@@ -1130,7 +1239,7 @@
         <w:pStyle w:val="ListNumber"/>
       </w:pPr>
       <w:r>
-        <w:t>Pode registar contribuições de capital (depósitos) de cada investidor.</w:t>
+        <w:t>Associe viaturas a um investidor no registo/edição da viatura.</w:t>
       </w:r>
     </w:p>
     <w:p>
@@ -1138,30 +1247,7 @@
         <w:pStyle w:val="ListNumber"/>
       </w:pPr>
       <w:r>
-        <w:t>Pode associar viaturas a um investidor no momento de registar ou editar a viatura.</w:t>
-      </w:r>
-    </w:p>
-    <w:p/>
-    <w:p>
-      <w:pPr>
-        <w:pStyle w:val="Heading2"/>
-      </w:pPr>
-      <w:r>
-        <w:rPr>
-          <w:color w:val="8A6A10"/>
-          <w:sz w:val="28"/>
-        </w:rPr>
-        <w:t>Convidar um investidor para o portal</w:t>
-      </w:r>
-    </w:p>
-    <w:p>
-      <w:r>
-        <w:rPr>
-          <w:b w:val="0"/>
-          <w:i w:val="0"/>
-          <w:sz w:val="22"/>
-        </w:rPr>
-        <w:t>Pode enviar um convite para que o investidor tenha acesso ao seu próprio portal, onde acompanha o capital e as viaturas. Ao aceitar o convite, o investidor cria a sua password e passa a poder iniciar sessão.</w:t>
+        <w:t>Pode convidar o investidor para aceder ao seu próprio portal.</w:t>
       </w:r>
     </w:p>
     <w:p>
@@ -1193,24 +1279,13 @@
     </w:p>
     <w:p/>
     <w:p>
-      <w:r>
-        <w:rPr>
-          <w:b w:val="0"/>
-          <w:i w:val="0"/>
-          <w:sz w:val="22"/>
-        </w:rPr>
-        <w:t>O menu «Relatórios» oferece duas vistas principais:</w:t>
-      </w:r>
-    </w:p>
-    <w:p/>
-    <w:p>
       <w:pPr>
         <w:pStyle w:val="Heading2"/>
       </w:pPr>
       <w:r>
         <w:rPr>
           <w:color w:val="8A6A10"/>
-          <w:sz w:val="28"/>
+          <w:sz w:val="26"/>
         </w:rPr>
         <w:t>Relatório de Viaturas</w:t>
       </w:r>
@@ -1225,6 +1300,58 @@
         <w:t>Mostra o desempenho por comercial e o detalhe das vendas, com margens e percentagens.</w:t>
       </w:r>
     </w:p>
+    <w:p>
+      <w:pPr>
+        <w:jc w:val="center"/>
+      </w:pPr>
+      <w:r>
+        <w:drawing>
+          <wp:inline xmlns:a="http://schemas.openxmlformats.org/drawingml/2006/main" xmlns:pic="http://schemas.openxmlformats.org/drawingml/2006/picture">
+            <wp:extent cx="5669280" cy="3986212"/>
+            <wp:docPr id="8" name="Picture 8"/>
+            <wp:cNvGraphicFramePr>
+              <a:graphicFrameLocks noChangeAspect="1"/>
+            </wp:cNvGraphicFramePr>
+            <a:graphic>
+              <a:graphicData uri="http://schemas.openxmlformats.org/drawingml/2006/picture">
+                <pic:pic>
+                  <pic:nvPicPr>
+                    <pic:cNvPr id="0" name="08-relatorio-viaturas.png"/>
+                    <pic:cNvPicPr/>
+                  </pic:nvPicPr>
+                  <pic:blipFill>
+                    <a:blip r:embed="rId16"/>
+                    <a:stretch>
+                      <a:fillRect/>
+                    </a:stretch>
+                  </pic:blipFill>
+                  <pic:spPr>
+                    <a:xfrm>
+                      <a:off x="0" y="0"/>
+                      <a:ext cx="5669280" cy="3986212"/>
+                    </a:xfrm>
+                    <a:prstGeom prst="rect"/>
+                  </pic:spPr>
+                </pic:pic>
+              </a:graphicData>
+            </a:graphic>
+          </wp:inline>
+        </w:drawing>
+      </w:r>
+    </w:p>
+    <w:p>
+      <w:pPr>
+        <w:jc w:val="center"/>
+      </w:pPr>
+      <w:r>
+        <w:rPr>
+          <w:i/>
+          <w:color w:val="555555"/>
+          <w:sz w:val="18"/>
+        </w:rPr>
+        <w:t>Figura 8 — Relatório de viaturas.</w:t>
+      </w:r>
+    </w:p>
     <w:p/>
     <w:p>
       <w:pPr>
@@ -1233,7 +1360,7 @@
       <w:r>
         <w:rPr>
           <w:color w:val="8A6A10"/>
-          <w:sz w:val="28"/>
+          <w:sz w:val="26"/>
         </w:rPr>
         <w:t>Relatório de Investidores</w:t>
       </w:r>
@@ -1245,7 +1372,59 @@
           <w:i w:val="0"/>
           <w:sz w:val="22"/>
         </w:rPr>
-        <w:t>Mostra a posição financeira de cada investidor: capital investido, viaturas, custos, vendas e saldo atual.</w:t>
+        <w:t>Mostra a posição financeira de cada investidor: capital, viaturas, custos, vendas e saldo.</w:t>
+      </w:r>
+    </w:p>
+    <w:p>
+      <w:pPr>
+        <w:jc w:val="center"/>
+      </w:pPr>
+      <w:r>
+        <w:drawing>
+          <wp:inline xmlns:a="http://schemas.openxmlformats.org/drawingml/2006/main" xmlns:pic="http://schemas.openxmlformats.org/drawingml/2006/picture">
+            <wp:extent cx="5669280" cy="3986212"/>
+            <wp:docPr id="9" name="Picture 9"/>
+            <wp:cNvGraphicFramePr>
+              <a:graphicFrameLocks noChangeAspect="1"/>
+            </wp:cNvGraphicFramePr>
+            <a:graphic>
+              <a:graphicData uri="http://schemas.openxmlformats.org/drawingml/2006/picture">
+                <pic:pic>
+                  <pic:nvPicPr>
+                    <pic:cNvPr id="0" name="09-relatorio-investidores.png"/>
+                    <pic:cNvPicPr/>
+                  </pic:nvPicPr>
+                  <pic:blipFill>
+                    <a:blip r:embed="rId17"/>
+                    <a:stretch>
+                      <a:fillRect/>
+                    </a:stretch>
+                  </pic:blipFill>
+                  <pic:spPr>
+                    <a:xfrm>
+                      <a:off x="0" y="0"/>
+                      <a:ext cx="5669280" cy="3986212"/>
+                    </a:xfrm>
+                    <a:prstGeom prst="rect"/>
+                  </pic:spPr>
+                </pic:pic>
+              </a:graphicData>
+            </a:graphic>
+          </wp:inline>
+        </w:drawing>
+      </w:r>
+    </w:p>
+    <w:p>
+      <w:pPr>
+        <w:jc w:val="center"/>
+      </w:pPr>
+      <w:r>
+        <w:rPr>
+          <w:i/>
+          <w:color w:val="555555"/>
+          <w:sz w:val="18"/>
+        </w:rPr>
+        <w:t>Figura 9 — Relatório de investidores.</w:t>
       </w:r>
     </w:p>
     <w:p/>
@@ -1256,7 +1435,7 @@
       <w:r>
         <w:rPr>
           <w:color w:val="8A6A10"/>
-          <w:sz w:val="28"/>
+          <w:sz w:val="26"/>
         </w:rPr>
         <w:t>Funcionalidades comuns</w:t>
       </w:r>
@@ -1266,7 +1445,7 @@
         <w:pStyle w:val="ListBullet"/>
       </w:pPr>
       <w:r>
-        <w:t>Ordenação: clique no cabeçalho de qualquer coluna para ordenar (ascendente/descendente).</w:t>
+        <w:t>Ordenação: clique no cabeçalho de qualquer coluna para ordenar.</w:t>
       </w:r>
     </w:p>
     <w:p>
@@ -1274,7 +1453,7 @@
         <w:pStyle w:val="ListBullet"/>
       </w:pPr>
       <w:r>
-        <w:t>Filtro por datas: escolha um intervalo de data a data, ou use os botões rápidos (último mês, últimos 3 meses, últimos 365 dias).</w:t>
+        <w:t>Filtro por datas: intervalo personalizado ou botões rápidos (último mês, 3 meses, 365 dias).</w:t>
       </w:r>
     </w:p>
     <w:p>
@@ -1282,7 +1461,7 @@
         <w:pStyle w:val="ListBullet"/>
       </w:pPr>
       <w:r>
-        <w:t>Botão «Hoje»: preenche rapidamente o campo de data com a data atual.</w:t>
+        <w:t>Botão «Hoje»: preenche o campo de data com a data atual.</w:t>
       </w:r>
     </w:p>
     <w:p>
@@ -1314,13 +1493,55 @@
     </w:p>
     <w:p/>
     <w:p>
+      <w:pPr>
+        <w:jc w:val="center"/>
+      </w:pPr>
+      <w:r>
+        <w:drawing>
+          <wp:inline xmlns:a="http://schemas.openxmlformats.org/drawingml/2006/main" xmlns:pic="http://schemas.openxmlformats.org/drawingml/2006/picture">
+            <wp:extent cx="5669280" cy="3986212"/>
+            <wp:docPr id="10" name="Picture 10"/>
+            <wp:cNvGraphicFramePr>
+              <a:graphicFrameLocks noChangeAspect="1"/>
+            </wp:cNvGraphicFramePr>
+            <a:graphic>
+              <a:graphicData uri="http://schemas.openxmlformats.org/drawingml/2006/picture">
+                <pic:pic>
+                  <pic:nvPicPr>
+                    <pic:cNvPr id="0" name="10-utilizadores.png"/>
+                    <pic:cNvPicPr/>
+                  </pic:nvPicPr>
+                  <pic:blipFill>
+                    <a:blip r:embed="rId18"/>
+                    <a:stretch>
+                      <a:fillRect/>
+                    </a:stretch>
+                  </pic:blipFill>
+                  <pic:spPr>
+                    <a:xfrm>
+                      <a:off x="0" y="0"/>
+                      <a:ext cx="5669280" cy="3986212"/>
+                    </a:xfrm>
+                    <a:prstGeom prst="rect"/>
+                  </pic:spPr>
+                </pic:pic>
+              </a:graphicData>
+            </a:graphic>
+          </wp:inline>
+        </w:drawing>
+      </w:r>
+    </w:p>
+    <w:p>
+      <w:pPr>
+        <w:jc w:val="center"/>
+      </w:pPr>
       <w:r>
         <w:rPr>
-          <w:b w:val="0"/>
-          <w:i w:val="0"/>
-          <w:sz w:val="22"/>
+          <w:i/>
+          <w:color w:val="555555"/>
+          <w:sz w:val="18"/>
         </w:rPr>
-        <w:t>No menu «Utilizadores» pode gerir as contas de acesso à aplicação.</w:t>
+        <w:t>Figura 10 — Gestão de utilizadores.</w:t>
       </w:r>
     </w:p>
     <w:p/>
@@ -1331,7 +1552,7 @@
       <w:r>
         <w:rPr>
           <w:color w:val="8A6A10"/>
-          <w:sz w:val="28"/>
+          <w:sz w:val="26"/>
         </w:rPr>
         <w:t>Criar um utilizador</w:t>
       </w:r>
@@ -1341,15 +1562,7 @@
         <w:pStyle w:val="ListNumber"/>
       </w:pPr>
       <w:r>
-        <w:t>Clique em «+ Novo Utilizador».</w:t>
-      </w:r>
-    </w:p>
-    <w:p>
-      <w:pPr>
-        <w:pStyle w:val="ListNumber"/>
-      </w:pPr>
-      <w:r>
-        <w:t>Preencha nome, email, password, telefone e escolha o papel.</w:t>
+        <w:t>Clique em «+ Novo Utilizador», preencha os dados e escolha o papel.</w:t>
       </w:r>
     </w:p>
     <w:p>
@@ -1360,6 +1573,44 @@
         <w:t>Clique em «Criar».</w:t>
       </w:r>
     </w:p>
+    <w:p/>
+    <w:p>
+      <w:pPr>
+        <w:pStyle w:val="Heading2"/>
+      </w:pPr>
+      <w:r>
+        <w:rPr>
+          <w:color w:val="8A6A10"/>
+          <w:sz w:val="26"/>
+        </w:rPr>
+        <w:t>Editar, suspender ou apagar</w:t>
+      </w:r>
+    </w:p>
+    <w:p>
+      <w:pPr>
+        <w:pStyle w:val="ListBullet"/>
+      </w:pPr>
+      <w:r>
+        <w:t>Editar — alterar nome, email, telefone e definir nova password.</w:t>
+      </w:r>
+    </w:p>
+    <w:p>
+      <w:pPr>
+        <w:pStyle w:val="ListBullet"/>
+      </w:pPr>
+      <w:r>
+        <w:t>Suspender — bloqueia o acesso (reversível com «Reativar»).</w:t>
+      </w:r>
+    </w:p>
+    <w:p>
+      <w:pPr>
+        <w:pStyle w:val="ListBullet"/>
+      </w:pPr>
+      <w:r>
+        <w:t>Apagar — elimina permanentemente a conta (irreversível).</w:t>
+      </w:r>
+    </w:p>
+    <w:p/>
     <w:p>
       <w:r>
         <w:rPr>
@@ -1368,97 +1619,7 @@
           <w:color w:val="555555"/>
           <w:sz w:val="22"/>
         </w:rPr>
-        <w:t>Nota: O Administrador pode criar comerciais, diretores e outros administradores. O Diretor apenas pode criar comerciais.</w:t>
-      </w:r>
-    </w:p>
-    <w:p/>
-    <w:p>
-      <w:pPr>
-        <w:pStyle w:val="Heading2"/>
-      </w:pPr>
-      <w:r>
-        <w:rPr>
-          <w:color w:val="8A6A10"/>
-          <w:sz w:val="28"/>
-        </w:rPr>
-        <w:t>Editar, suspender ou apagar</w:t>
-      </w:r>
-    </w:p>
-    <w:p>
-      <w:r>
-        <w:rPr>
-          <w:b w:val="0"/>
-          <w:i w:val="0"/>
-          <w:sz w:val="22"/>
-        </w:rPr>
-        <w:t>Cada utilizador na lista tem botões de ação:</w:t>
-      </w:r>
-    </w:p>
-    <w:p>
-      <w:pPr>
-        <w:pStyle w:val="ListBullet"/>
-      </w:pPr>
-      <w:r>
-        <w:t>Editar — alterar nome, email, telefone e definir uma nova password.</w:t>
-      </w:r>
-    </w:p>
-    <w:p>
-      <w:pPr>
-        <w:pStyle w:val="ListBullet"/>
-      </w:pPr>
-      <w:r>
-        <w:t>Suspender — bloqueia o acesso do utilizador (não pode iniciar sessão). Pode ser revertido com «Reativar».</w:t>
-      </w:r>
-    </w:p>
-    <w:p>
-      <w:pPr>
-        <w:pStyle w:val="ListBullet"/>
-      </w:pPr>
-      <w:r>
-        <w:t>Apagar — elimina permanentemente a conta (ação irreversível).</w:t>
-      </w:r>
-    </w:p>
-    <w:p/>
-    <w:p>
-      <w:r>
-        <w:rPr>
-          <w:b/>
-          <w:i w:val="0"/>
-          <w:sz w:val="22"/>
-        </w:rPr>
-        <w:t>Regras de permissão:</w:t>
-      </w:r>
-    </w:p>
-    <w:p>
-      <w:pPr>
-        <w:pStyle w:val="ListBullet"/>
-      </w:pPr>
-      <w:r>
-        <w:t>O Administrador pode gerir todos os utilizadores.</w:t>
-      </w:r>
-    </w:p>
-    <w:p>
-      <w:pPr>
-        <w:pStyle w:val="ListBullet"/>
-      </w:pPr>
-      <w:r>
-        <w:t>O Diretor apenas pode gerir os comerciais e investidores da sua equipa.</w:t>
-      </w:r>
-    </w:p>
-    <w:p>
-      <w:pPr>
-        <w:pStyle w:val="ListBullet"/>
-      </w:pPr>
-      <w:r>
-        <w:t>Ninguém pode suspender ou apagar a sua própria conta.</w:t>
-      </w:r>
-    </w:p>
-    <w:p>
-      <w:pPr>
-        <w:pStyle w:val="ListBullet"/>
-      </w:pPr>
-      <w:r>
-        <w:t>Um utilizador suspenso aparece a cinzento com o estado «Suspenso».</w:t>
+        <w:t>Regras: o Administrador gere todos; o Diretor apenas os comerciais e investidores da sua equipa; ninguém pode suspender ou apagar a própria conta.</w:t>
       </w:r>
     </w:p>
     <w:p>
@@ -1485,31 +1646,60 @@
           <w:i w:val="0"/>
           <w:sz w:val="22"/>
         </w:rPr>
-        <w:t>Todos os utilizadores têm acesso à página «Perfil», onde podem:</w:t>
+        <w:t>Todos os utilizadores têm acesso à página «Perfil», onde podem consultar os seus dados, atualizar email/telefone e alterar a password.</w:t>
+      </w:r>
+    </w:p>
+    <w:p/>
+    <w:p>
+      <w:pPr>
+        <w:jc w:val="center"/>
+      </w:pPr>
+      <w:r>
+        <w:drawing>
+          <wp:inline xmlns:a="http://schemas.openxmlformats.org/drawingml/2006/main" xmlns:pic="http://schemas.openxmlformats.org/drawingml/2006/picture">
+            <wp:extent cx="5669280" cy="3986212"/>
+            <wp:docPr id="11" name="Picture 11"/>
+            <wp:cNvGraphicFramePr>
+              <a:graphicFrameLocks noChangeAspect="1"/>
+            </wp:cNvGraphicFramePr>
+            <a:graphic>
+              <a:graphicData uri="http://schemas.openxmlformats.org/drawingml/2006/picture">
+                <pic:pic>
+                  <pic:nvPicPr>
+                    <pic:cNvPr id="0" name="11-perfil.png"/>
+                    <pic:cNvPicPr/>
+                  </pic:nvPicPr>
+                  <pic:blipFill>
+                    <a:blip r:embed="rId19"/>
+                    <a:stretch>
+                      <a:fillRect/>
+                    </a:stretch>
+                  </pic:blipFill>
+                  <pic:spPr>
+                    <a:xfrm>
+                      <a:off x="0" y="0"/>
+                      <a:ext cx="5669280" cy="3986212"/>
+                    </a:xfrm>
+                    <a:prstGeom prst="rect"/>
+                  </pic:spPr>
+                </pic:pic>
+              </a:graphicData>
+            </a:graphic>
+          </wp:inline>
+        </w:drawing>
       </w:r>
     </w:p>
     <w:p>
       <w:pPr>
-        <w:pStyle w:val="ListBullet"/>
+        <w:jc w:val="center"/>
       </w:pPr>
       <w:r>
-        <w:t>Consultar os seus dados (nome, email, papel).</w:t>
-      </w:r>
-    </w:p>
-    <w:p>
-      <w:pPr>
-        <w:pStyle w:val="ListBullet"/>
-      </w:pPr>
-      <w:r>
-        <w:t>Atualizar o email e telefone.</w:t>
-      </w:r>
-    </w:p>
-    <w:p>
-      <w:pPr>
-        <w:pStyle w:val="ListBullet"/>
-      </w:pPr>
-      <w:r>
-        <w:t>Alterar a sua password.</w:t>
+        <w:rPr>
+          <w:i/>
+          <w:color w:val="555555"/>
+          <w:sz w:val="18"/>
+        </w:rPr>
+        <w:t>Figura 11 — Página de perfil pessoal.</w:t>
       </w:r>
     </w:p>
     <w:p/>
@@ -1520,7 +1710,7 @@
       <w:r>
         <w:rPr>
           <w:color w:val="8A6A10"/>
-          <w:sz w:val="28"/>
+          <w:sz w:val="26"/>
         </w:rPr>
         <w:t>Alterar a password</w:t>
       </w:r>
@@ -1538,7 +1728,7 @@
         <w:pStyle w:val="ListNumber"/>
       </w:pPr>
       <w:r>
-        <w:t>Na secção «Alterar Password», introduza a password atual.</w:t>
+        <w:t>Introduza a password atual.</w:t>
       </w:r>
     </w:p>
     <w:p>
@@ -1584,7 +1774,6 @@
         <w:t>(Exclusivo para utilizadores com perfil Investidor)</w:t>
       </w:r>
     </w:p>
-    <w:p/>
     <w:p>
       <w:r>
         <w:rPr>
@@ -1592,7 +1781,7 @@
           <w:i w:val="0"/>
           <w:sz w:val="22"/>
         </w:rPr>
-        <w:t>Quando um investidor inicia sessão, acede diretamente ao «Portal do Investidor», que apresenta:</w:t>
+        <w:t>Quando um investidor inicia sessão, acede ao «Portal do Investidor», que apresenta:</w:t>
       </w:r>
     </w:p>
     <w:p>
@@ -1640,7 +1829,7 @@
         <w:pStyle w:val="ListBullet"/>
       </w:pPr>
       <w:r>
-        <w:t>Cronologia de todos os movimentos (contribuições, compras, custos e vendas).</w:t>
+        <w:t>Cronologia de todos os movimentos.</w:t>
       </w:r>
     </w:p>
     <w:p>
@@ -1677,7 +1866,7 @@
           <w:i w:val="0"/>
           <w:sz w:val="22"/>
         </w:rPr>
-        <w:t>Contacte o seu diretor ou administrador. Estes podem definir-lhe uma nova password através da gestão de utilizadores.</w:t>
+        <w:t>Contacte o seu diretor ou administrador, que podem definir-lhe uma nova password.</w:t>
       </w:r>
     </w:p>
     <w:p/>
@@ -1688,7 +1877,7 @@
           <w:i w:val="0"/>
           <w:sz w:val="22"/>
         </w:rPr>
-        <w:t>Porque não consigo ver o menu «Utilizadores» ou «Investidores»?</w:t>
+        <w:t>Porque não vejo o menu «Utilizadores» ou «Investidores»?</w:t>
       </w:r>
     </w:p>
     <w:p>
@@ -1698,7 +1887,7 @@
           <w:i w:val="0"/>
           <w:sz w:val="22"/>
         </w:rPr>
-        <w:t>Esses menus só estão disponíveis para Administradores e Diretores. Comerciais e investidores não têm acesso.</w:t>
+        <w:t>Esses menus só estão disponíveis para Administradores e Diretores.</w:t>
       </w:r>
     </w:p>
     <w:p/>
@@ -1709,7 +1898,7 @@
           <w:i w:val="0"/>
           <w:sz w:val="22"/>
         </w:rPr>
-        <w:t>Uma viatura pode pertencer a um investidor e estar em stock ao mesmo tempo?</w:t>
+        <w:t>Uma viatura pode pertencer a um investidor e estar em stock?</w:t>
       </w:r>
     </w:p>
     <w:p>
@@ -1719,7 +1908,7 @@
           <w:i w:val="0"/>
           <w:sz w:val="22"/>
         </w:rPr>
-        <w:t>Sim. A viatura pode estar Em Stock, Reservada ou Vendida e ainda assim pertencer a um investidor, pois o capital é dele até à venda. Essa viatura aparece tanto no stock como na área de investidores.</w:t>
+        <w:t>Sim. Pode estar Em Stock, Reservada ou Vendida e pertencer a um investidor, pois o capital é dele até à venda.</w:t>
       </w:r>
     </w:p>
     <w:p/>
@@ -1730,7 +1919,7 @@
           <w:i w:val="0"/>
           <w:sz w:val="22"/>
         </w:rPr>
-        <w:t>Quem consegue ver o histórico de alterações de uma viatura?</w:t>
+        <w:t>Quem vê o histórico de alterações?</w:t>
       </w:r>
     </w:p>
     <w:p>
@@ -1740,7 +1929,7 @@
           <w:i w:val="0"/>
           <w:sz w:val="22"/>
         </w:rPr>
-        <w:t>Qualquer utilizador com acesso à viatura pode expandir a linha na lista de viaturas e ver o histórico.</w:t>
+        <w:t>Qualquer utilizador com acesso à viatura, expandindo a linha na lista de viaturas.</w:t>
       </w:r>
     </w:p>
     <w:p/>
@@ -1761,7 +1950,7 @@
           <w:i w:val="0"/>
           <w:sz w:val="22"/>
         </w:rPr>
-        <w:t>O histórico regista as alterações a partir do momento em que a funcionalidade foi ativada. Alterações anteriores não têm registo, mas todas as futuras ficam guardadas.</w:t>
+        <w:t>O histórico regista a partir da ativação da funcionalidade; todas as futuras ficam guardadas.</w:t>
       </w:r>
     </w:p>
     <w:p/>
@@ -1772,7 +1961,7 @@
           <w:i w:val="0"/>
           <w:sz w:val="22"/>
         </w:rPr>
-        <w:t>Perco os meus dados se sair da aplicação?</w:t>
+        <w:t>Perco os dados ao sair?</w:t>
       </w:r>
     </w:p>
     <w:p>
@@ -1782,10 +1971,9 @@
           <w:i w:val="0"/>
           <w:sz w:val="22"/>
         </w:rPr>
-        <w:t>Não. Todos os dados são guardados numa base de dados na cloud e ficam sempre disponíveis quando voltar a iniciar sessão.</w:t>
+        <w:t>Não. Tudo é guardado numa base de dados na cloud, sempre disponível ao voltar a entrar.</w:t>
       </w:r>
     </w:p>
-    <w:p/>
     <w:p/>
     <w:p>
       <w:pPr>

</xml_diff>